<commit_message>
docs: complete settings reference — document every setting with examples
Bring the Settings Reference up to date and to full coverage:

- Add the Instant Product Update on Save settings (instant_product_update +
  instant_purge_categories) with a worked example and how-it-works.
- Add the Results Grid Columns setting; fix the stale Facet Attributes default
  (now empty) to match the shipped config.
- Add a Footer Credit section (fastmagento/credit/show) — previously undocumented.
- Note the thesaurus CLI on the Generate Thesaurus card; extend the CLI cheat-sheet.
- Add a print stylesheet for clean PDF output.

Regenerate the distributable PDF (headless render) and Word reference alongside
the HTML page.
</commit_message>
<xml_diff>
--- a/docs/FastMagento-Settings-Reference.docx
+++ b/docs/FastMagento-Settings-Reference.docx
@@ -80,7 +80,7 @@
       <w:pPr>
         <w:pStyle w:val="BodyText"/>
         <w:bidi w:val="0"/>
-        <w:spacing w:lineRule="auto" w:line="384" w:before="330" w:after="140"/>
+        <w:spacing w:lineRule="auto" w:line="384" w:before="330" w:after="283"/>
         <w:ind w:hanging="0" w:left="0" w:right="0"/>
         <w:jc w:val="left"/>
         <w:rPr>
@@ -307,6 +307,23 @@
         </w:rPr>
         <w:t xml:space="preserve"> </w:t>
       </w:r>
+      <w:hyperlink w:anchor="credit">
+        <w:r>
+          <w:rPr>
+            <w:rStyle w:val="Hyperlink"/>
+            <w:rFonts w:ascii="var sans" w:hAnsi="var sans"/>
+            <w:sz w:val="24"/>
+          </w:rPr>
+          <w:t>7 Footer Credit</w:t>
+        </w:r>
+      </w:hyperlink>
+      <w:r>
+        <w:rPr>
+          <w:rFonts w:ascii="var sans" w:hAnsi="var sans"/>
+          <w:sz w:val="24"/>
+        </w:rPr>
+        <w:t xml:space="preserve"> </w:t>
+      </w:r>
       <w:hyperlink w:anchor="advanced">
         <w:r>
           <w:rPr>
@@ -314,7 +331,7 @@
             <w:rFonts w:ascii="var sans" w:hAnsi="var sans"/>
             <w:sz w:val="24"/>
           </w:rPr>
-          <w:t>7 Advanced (config-only)</w:t>
+          <w:t>8 Advanced (config-only)</w:t>
         </w:r>
       </w:hyperlink>
       <w:r>
@@ -1303,6 +1320,363 @@
           <w:bdr w:val="single" w:sz="2" w:space="9" w:color="000000"/>
         </w:rPr>
         <w:t>magento2_categories</w:t>
+      </w:r>
+    </w:p>
+    <w:p>
+      <w:pPr>
+        <w:pStyle w:val="Heading3"/>
+        <w:bidi w:val="0"/>
+        <w:spacing w:lineRule="auto" w:line="384" w:before="0" w:after="60"/>
+        <w:ind w:hanging="0" w:left="0" w:right="0"/>
+        <w:jc w:val="left"/>
+        <w:rPr>
+          <w:rFonts w:ascii="var sans" w:hAnsi="var sans"/>
+          <w:sz w:val="24"/>
+          <w:bdr w:val="single" w:sz="2" w:space="17" w:color="000000"/>
+        </w:rPr>
+      </w:pPr>
+      <w:r>
+        <w:rPr>
+          <w:rFonts w:ascii="var sans" w:hAnsi="var sans"/>
+          <w:sz w:val="24"/>
+          <w:bdr w:val="single" w:sz="2" w:space="17" w:color="000000"/>
+        </w:rPr>
+        <w:t>Instant Product Update on Save v2.2.0</w:t>
+      </w:r>
+    </w:p>
+    <w:p>
+      <w:pPr>
+        <w:pStyle w:val="BodyText"/>
+        <w:bidi w:val="0"/>
+        <w:spacing w:lineRule="auto" w:line="384" w:before="0" w:after="60"/>
+        <w:ind w:hanging="0" w:left="0" w:right="0"/>
+        <w:jc w:val="left"/>
+        <w:rPr>
+          <w:rFonts w:ascii="var sans" w:hAnsi="var sans"/>
+          <w:sz w:val="24"/>
+          <w:bdr w:val="single" w:sz="2" w:space="17" w:color="000000"/>
+        </w:rPr>
+      </w:pPr>
+      <w:r>
+        <w:rPr>
+          <w:rFonts w:ascii="var sans" w:hAnsi="var sans"/>
+          <w:sz w:val="24"/>
+          <w:bdr w:val="single" w:sz="2" w:space="17" w:color="000000"/>
+        </w:rPr>
+        <w:t>Yes / NoDefault: NoStore-level</w:t>
+      </w:r>
+    </w:p>
+    <w:p>
+      <w:pPr>
+        <w:pStyle w:val="BodyText"/>
+        <w:bidi w:val="0"/>
+        <w:spacing w:lineRule="auto" w:line="384" w:before="120" w:after="180"/>
+        <w:ind w:hanging="0" w:left="120" w:right="120"/>
+        <w:jc w:val="left"/>
+        <w:rPr>
+          <w:rFonts w:ascii="var sans" w:hAnsi="var sans"/>
+          <w:sz w:val="24"/>
+          <w:bdr w:val="single" w:sz="2" w:space="17" w:color="000000"/>
+        </w:rPr>
+      </w:pPr>
+      <w:r>
+        <w:rPr>
+          <w:rFonts w:ascii="var mono" w:hAnsi="var mono"/>
+          <w:sz w:val="18"/>
+        </w:rPr>
+        <w:t>fastmagento/indexing/instant_product_update</w:t>
+      </w:r>
+      <w:r>
+        <w:rPr>
+          <w:rFonts w:ascii="var sans" w:hAnsi="var sans"/>
+          <w:sz w:val="24"/>
+          <w:bdr w:val="single" w:sz="2" w:space="17" w:color="000000"/>
+        </w:rPr>
+        <w:t xml:space="preserve"> </w:t>
+      </w:r>
+    </w:p>
+    <w:p>
+      <w:pPr>
+        <w:pStyle w:val="BodyText"/>
+        <w:bidi w:val="0"/>
+        <w:spacing w:lineRule="auto" w:line="384" w:before="0" w:after="270"/>
+        <w:jc w:val="left"/>
+        <w:rPr/>
+      </w:pPr>
+      <w:r>
+        <w:rPr>
+          <w:rFonts w:ascii="var sans" w:hAnsi="var sans"/>
+          <w:sz w:val="24"/>
+          <w:bdr w:val="single" w:sz="2" w:space="17" w:color="000000"/>
+        </w:rPr>
+        <w:t xml:space="preserve">Makes a catalogue edit go live on the storefront the </w:t>
+      </w:r>
+      <w:r>
+        <w:rPr>
+          <w:rStyle w:val="Emphasis"/>
+          <w:rFonts w:ascii="var sans" w:hAnsi="var sans"/>
+          <w:sz w:val="24"/>
+          <w:bdr w:val="single" w:sz="2" w:space="17" w:color="000000"/>
+        </w:rPr>
+        <w:t>moment it is saved</w:t>
+      </w:r>
+      <w:r>
+        <w:rPr>
+          <w:rFonts w:ascii="var sans" w:hAnsi="var sans"/>
+          <w:sz w:val="24"/>
+          <w:bdr w:val="single" w:sz="2" w:space="17" w:color="000000"/>
+        </w:rPr>
+        <w:t xml:space="preserve"> — instead of waiting on the scheduled indexer and full-page cache. The classic "I saved it but I still don't see it" delay, gone.</w:t>
+      </w:r>
+    </w:p>
+    <w:p>
+      <w:pPr>
+        <w:pStyle w:val="BodyText"/>
+        <w:bidi w:val="0"/>
+        <w:spacing w:lineRule="auto" w:line="384" w:before="180" w:after="60"/>
+        <w:ind w:hanging="0" w:left="180" w:right="180"/>
+        <w:jc w:val="left"/>
+        <w:rPr/>
+      </w:pPr>
+      <w:r>
+        <w:rPr>
+          <w:rFonts w:ascii="var sans" w:hAnsi="var sans"/>
+          <w:sz w:val="21"/>
+          <w:bdr w:val="single" w:sz="2" w:space="9" w:color="000000"/>
+        </w:rPr>
+        <w:t xml:space="preserve">ExampleMerchandiser fixes a typo in a product name and clicks Save. With the FastMagento product indexer on </w:t>
+      </w:r>
+      <w:r>
+        <w:rPr>
+          <w:rStyle w:val="Emphasis"/>
+          <w:rFonts w:ascii="var sans" w:hAnsi="var sans"/>
+          <w:sz w:val="21"/>
+          <w:bdr w:val="single" w:sz="2" w:space="9" w:color="000000"/>
+        </w:rPr>
+        <w:t>Update by Schedule</w:t>
+      </w:r>
+      <w:r>
+        <w:rPr>
+          <w:rFonts w:ascii="var sans" w:hAnsi="var sans"/>
+          <w:sz w:val="21"/>
+          <w:bdr w:val="single" w:sz="2" w:space="9" w:color="000000"/>
+        </w:rPr>
+        <w:t xml:space="preserve"> (a large backlog), the fix would normally not appear until the next cron reindex. With this </w:t>
+      </w:r>
+      <w:r>
+        <w:rPr>
+          <w:rFonts w:ascii="var sans" w:hAnsi="var sans"/>
+          <w:b/>
+          <w:sz w:val="21"/>
+          <w:bdr w:val="single" w:sz="2" w:space="9" w:color="000000"/>
+        </w:rPr>
+        <w:t>On</w:t>
+      </w:r>
+      <w:r>
+        <w:rPr>
+          <w:rFonts w:ascii="var sans" w:hAnsi="var sans"/>
+          <w:sz w:val="21"/>
+          <w:bdr w:val="single" w:sz="2" w:space="9" w:color="000000"/>
+        </w:rPr>
+        <w:t>, the OpenSearch doc is updated and the product's cached pages are purged before the save even returns — the next storefront view shows the fix.</w:t>
+      </w:r>
+    </w:p>
+    <w:p>
+      <w:pPr>
+        <w:pStyle w:val="BodyText"/>
+        <w:bidi w:val="0"/>
+        <w:spacing w:lineRule="auto" w:line="384" w:before="0" w:after="270"/>
+        <w:jc w:val="left"/>
+        <w:rPr/>
+      </w:pPr>
+      <w:r>
+        <w:rPr>
+          <w:rFonts w:ascii="var sans" w:hAnsi="var sans"/>
+          <w:b/>
+          <w:sz w:val="24"/>
+          <w:bdr w:val="single" w:sz="2" w:space="17" w:color="000000"/>
+        </w:rPr>
+        <w:t>How it works.</w:t>
+      </w:r>
+      <w:r>
+        <w:rPr>
+          <w:rFonts w:ascii="var sans" w:hAnsi="var sans"/>
+          <w:sz w:val="24"/>
+          <w:bdr w:val="single" w:sz="2" w:space="17" w:color="000000"/>
+        </w:rPr>
+        <w:t xml:space="preserve"> On </w:t>
+      </w:r>
+      <w:r>
+        <w:rPr>
+          <w:rStyle w:val="SourceTextinl"/>
+          <w:rFonts w:ascii="var sans" w:hAnsi="var sans"/>
+          <w:sz w:val="24"/>
+          <w:bdr w:val="single" w:sz="2" w:space="17" w:color="000000"/>
+        </w:rPr>
+        <w:t>catalog_product_save_commit_after</w:t>
+      </w:r>
+      <w:r>
+        <w:rPr>
+          <w:rFonts w:ascii="var sans" w:hAnsi="var sans"/>
+          <w:sz w:val="24"/>
+          <w:bdr w:val="single" w:sz="2" w:space="17" w:color="000000"/>
+        </w:rPr>
+        <w:t xml:space="preserve"> (after the DB commit, so a rolled-back save never desyncs the index), it (1) reprojects the saved product </w:t>
+      </w:r>
+      <w:r>
+        <w:rPr>
+          <w:rStyle w:val="Emphasis"/>
+          <w:rFonts w:ascii="var sans" w:hAnsi="var sans"/>
+          <w:sz w:val="24"/>
+          <w:bdr w:val="single" w:sz="2" w:space="17" w:color="000000"/>
+        </w:rPr>
+        <w:t>and any configurable/grouped/bundle parent</w:t>
+      </w:r>
+      <w:r>
+        <w:rPr>
+          <w:rFonts w:ascii="var sans" w:hAnsi="var sans"/>
+          <w:sz w:val="24"/>
+          <w:bdr w:val="single" w:sz="2" w:space="17" w:color="000000"/>
+        </w:rPr>
+        <w:t xml:space="preserve"> straight into OpenSearch, bypassing the mview changelog, and (2) purges the full-page cache by dispatching Magento's own </w:t>
+      </w:r>
+      <w:r>
+        <w:rPr>
+          <w:rStyle w:val="SourceTextinl"/>
+          <w:rFonts w:ascii="var sans" w:hAnsi="var sans"/>
+          <w:sz w:val="24"/>
+          <w:bdr w:val="single" w:sz="2" w:space="17" w:color="000000"/>
+        </w:rPr>
+        <w:t>clean_cache_by_tags</w:t>
+      </w:r>
+      <w:r>
+        <w:rPr>
+          <w:rFonts w:ascii="var sans" w:hAnsi="var sans"/>
+          <w:sz w:val="24"/>
+          <w:bdr w:val="single" w:sz="2" w:space="17" w:color="000000"/>
+        </w:rPr>
+        <w:t xml:space="preserve"> — so built-in FPC, Varnish (correctly anchored) or a CDN like Fastly each invalidate the right pages. Both halves are best-effort: a failure is logged and never blocks the save.</w:t>
+      </w:r>
+    </w:p>
+    <w:p>
+      <w:pPr>
+        <w:pStyle w:val="BodyText"/>
+        <w:bidi w:val="0"/>
+        <w:spacing w:lineRule="auto" w:line="384" w:before="0" w:after="270"/>
+        <w:jc w:val="left"/>
+        <w:rPr/>
+      </w:pPr>
+      <w:r>
+        <w:rPr>
+          <w:rFonts w:ascii="var sans" w:hAnsi="var sans"/>
+          <w:b/>
+          <w:sz w:val="24"/>
+          <w:bdr w:val="single" w:sz="2" w:space="17" w:color="000000"/>
+        </w:rPr>
+        <w:t>Off by default (opt-in):</w:t>
+      </w:r>
+      <w:r>
+        <w:rPr>
+          <w:rFonts w:ascii="var sans" w:hAnsi="var sans"/>
+          <w:sz w:val="24"/>
+          <w:bdr w:val="single" w:sz="2" w:space="17" w:color="000000"/>
+        </w:rPr>
+        <w:t xml:space="preserve"> it adds a reprojection + cache purge to </w:t>
+      </w:r>
+      <w:r>
+        <w:rPr>
+          <w:rStyle w:val="Emphasis"/>
+          <w:rFonts w:ascii="var sans" w:hAnsi="var sans"/>
+          <w:sz w:val="24"/>
+          <w:bdr w:val="single" w:sz="2" w:space="17" w:color="000000"/>
+        </w:rPr>
+        <w:t>every</w:t>
+      </w:r>
+      <w:r>
+        <w:rPr>
+          <w:rFonts w:ascii="var sans" w:hAnsi="var sans"/>
+          <w:sz w:val="24"/>
+          <w:bdr w:val="single" w:sz="2" w:space="17" w:color="000000"/>
+        </w:rPr>
+        <w:t xml:space="preserve"> product save, including admin mass actions and </w:t>
+      </w:r>
+      <w:r>
+        <w:rPr>
+          <w:rStyle w:val="SourceTextinl"/>
+          <w:rFonts w:ascii="var sans" w:hAnsi="var sans"/>
+          <w:sz w:val="24"/>
+          <w:bdr w:val="single" w:sz="2" w:space="17" w:color="000000"/>
+        </w:rPr>
+        <w:t>productRepository-&gt;save()</w:t>
+      </w:r>
+      <w:r>
+        <w:rPr>
+          <w:rFonts w:ascii="var sans" w:hAnsi="var sans"/>
+          <w:sz w:val="24"/>
+          <w:bdr w:val="single" w:sz="2" w:space="17" w:color="000000"/>
+        </w:rPr>
+        <w:t xml:space="preserve"> loops. The native CSV importer uses direct SQL and doesn't fire the event, so bulk imports are unaffected. Adds new DI — run </w:t>
+      </w:r>
+      <w:r>
+        <w:rPr>
+          <w:rStyle w:val="SourceTextinl"/>
+          <w:rFonts w:ascii="var sans" w:hAnsi="var sans"/>
+          <w:sz w:val="24"/>
+          <w:bdr w:val="single" w:sz="2" w:space="17" w:color="000000"/>
+        </w:rPr>
+        <w:t>bin/magento setup:di:compile</w:t>
+      </w:r>
+      <w:r>
+        <w:rPr>
+          <w:rFonts w:ascii="var sans" w:hAnsi="var sans"/>
+          <w:sz w:val="24"/>
+          <w:bdr w:val="single" w:sz="2" w:space="17" w:color="000000"/>
+        </w:rPr>
+        <w:t xml:space="preserve"> on deploy.</w:t>
+      </w:r>
+    </w:p>
+    <w:p>
+      <w:pPr>
+        <w:pStyle w:val="BodyText"/>
+        <w:bidi w:val="0"/>
+        <w:spacing w:lineRule="auto" w:line="384" w:before="180" w:after="180"/>
+        <w:ind w:hanging="0" w:left="180" w:right="180"/>
+        <w:jc w:val="left"/>
+        <w:rPr/>
+      </w:pPr>
+      <w:r>
+        <w:rPr>
+          <w:rFonts w:ascii="var sans" w:hAnsi="var sans"/>
+          <w:b/>
+          <w:sz w:val="24"/>
+          <w:bdr w:val="dashed" w:sz="2" w:space="9" w:color="000000"/>
+        </w:rPr>
+        <w:t>Category pages</w:t>
+      </w:r>
+      <w:r>
+        <w:rPr>
+          <w:rFonts w:ascii="var sans" w:hAnsi="var sans"/>
+          <w:sz w:val="24"/>
+          <w:bdr w:val="dashed" w:sz="2" w:space="9" w:color="000000"/>
+        </w:rPr>
+        <w:t xml:space="preserve"> v2.2.0</w:t>
+      </w:r>
+      <w:r>
+        <w:rPr>
+          <w:rStyle w:val="SourceTextinl"/>
+          <w:rFonts w:ascii="var sans" w:hAnsi="var sans"/>
+          <w:sz w:val="24"/>
+          <w:bdr w:val="dashed" w:sz="2" w:space="9" w:color="000000"/>
+        </w:rPr>
+        <w:t>fastmagento/indexing/instant_purge_categories</w:t>
+      </w:r>
+      <w:r>
+        <w:rPr>
+          <w:rFonts w:ascii="var sans" w:hAnsi="var sans"/>
+          <w:sz w:val="24"/>
+          <w:bdr w:val="dashed" w:sz="2" w:space="9" w:color="000000"/>
+        </w:rPr>
+        <w:t xml:space="preserve"> — when the cache is purged, also purge the pages of the categories the product belongs to (so listings reflect the edit, not just the product page). Root/default categories are excluded. Default: Yes</w:t>
       </w:r>
     </w:p>
     <w:p>
@@ -3392,7 +3766,7 @@
           <w:sz w:val="24"/>
           <w:bdr w:val="single" w:sz="2" w:space="17" w:color="000000"/>
         </w:rPr>
-        <w:t>TextDefault: part_type, color, size, link_style, shock_spacingStore-level</w:t>
+        <w:t>TextDefault: emptyStore-level</w:t>
       </w:r>
     </w:p>
     <w:p>
@@ -3442,7 +3816,7 @@
           <w:sz w:val="24"/>
           <w:bdr w:val="single" w:sz="2" w:space="17" w:color="000000"/>
         </w:rPr>
-        <w:t>Comma-separated attribute codes that become the filter facets on the instant-search results page. Category is always included automatically.</w:t>
+        <w:t>Comma-separated attribute codes that become the filter facets on the instant-search results page. Category is always included automatically. Codes that don't exist on your catalogue are skipped.</w:t>
       </w:r>
     </w:p>
     <w:p>
@@ -3507,7 +3881,225 @@
           <w:sz w:val="24"/>
           <w:bdr w:val="single" w:sz="2" w:space="17" w:color="000000"/>
         </w:rPr>
-        <w:t xml:space="preserve"> attributes. Their option labels resolve cleanly from the index; multi-select attributes aren't supported here yet (they need an indexed option dictionary).</w:t>
+        <w:t xml:space="preserve"> attributes. Their option labels resolve cleanly from the index; multi-select attributes aren't supported here yet (they need an indexed option dictionary). </w:t>
+      </w:r>
+      <w:r>
+        <w:rPr>
+          <w:rFonts w:ascii="var sans" w:hAnsi="var sans"/>
+          <w:b/>
+          <w:sz w:val="24"/>
+          <w:bdr w:val="single" w:sz="2" w:space="17" w:color="000000"/>
+        </w:rPr>
+        <w:t>Ships empty on purpose</w:t>
+      </w:r>
+      <w:r>
+        <w:rPr>
+          <w:rFonts w:ascii="var sans" w:hAnsi="var sans"/>
+          <w:sz w:val="24"/>
+          <w:bdr w:val="single" w:sz="2" w:space="17" w:color="000000"/>
+        </w:rPr>
+        <w:t xml:space="preserve"> — a catalogue-specific default would silently break facets on stores lacking those exact codes.</w:t>
+      </w:r>
+    </w:p>
+    <w:p>
+      <w:pPr>
+        <w:pStyle w:val="Heading3"/>
+        <w:bidi w:val="0"/>
+        <w:spacing w:lineRule="auto" w:line="384" w:before="0" w:after="60"/>
+        <w:ind w:hanging="0" w:left="0" w:right="0"/>
+        <w:jc w:val="left"/>
+        <w:rPr>
+          <w:rFonts w:ascii="var sans" w:hAnsi="var sans"/>
+          <w:sz w:val="24"/>
+          <w:bdr w:val="single" w:sz="2" w:space="17" w:color="000000"/>
+        </w:rPr>
+      </w:pPr>
+      <w:r>
+        <w:rPr>
+          <w:rFonts w:ascii="var sans" w:hAnsi="var sans"/>
+          <w:sz w:val="24"/>
+          <w:bdr w:val="single" w:sz="2" w:space="17" w:color="000000"/>
+        </w:rPr>
+        <w:t>Results Grid Columns v2.1.0</w:t>
+      </w:r>
+    </w:p>
+    <w:p>
+      <w:pPr>
+        <w:pStyle w:val="BodyText"/>
+        <w:bidi w:val="0"/>
+        <w:spacing w:lineRule="auto" w:line="384" w:before="0" w:after="60"/>
+        <w:ind w:hanging="0" w:left="0" w:right="0"/>
+        <w:jc w:val="left"/>
+        <w:rPr>
+          <w:rFonts w:ascii="var sans" w:hAnsi="var sans"/>
+          <w:sz w:val="24"/>
+          <w:bdr w:val="single" w:sz="2" w:space="17" w:color="000000"/>
+        </w:rPr>
+      </w:pPr>
+      <w:r>
+        <w:rPr>
+          <w:rFonts w:ascii="var sans" w:hAnsi="var sans"/>
+          <w:sz w:val="24"/>
+          <w:bdr w:val="single" w:sz="2" w:space="17" w:color="000000"/>
+        </w:rPr>
+        <w:t>Number (1–6)Default: 4Store-level</w:t>
+      </w:r>
+    </w:p>
+    <w:p>
+      <w:pPr>
+        <w:pStyle w:val="BodyText"/>
+        <w:bidi w:val="0"/>
+        <w:spacing w:lineRule="auto" w:line="384" w:before="120" w:after="180"/>
+        <w:ind w:hanging="0" w:left="120" w:right="120"/>
+        <w:jc w:val="left"/>
+        <w:rPr>
+          <w:rFonts w:ascii="var sans" w:hAnsi="var sans"/>
+          <w:sz w:val="24"/>
+          <w:bdr w:val="single" w:sz="2" w:space="17" w:color="000000"/>
+        </w:rPr>
+      </w:pPr>
+      <w:r>
+        <w:rPr>
+          <w:rFonts w:ascii="var mono" w:hAnsi="var mono"/>
+          <w:sz w:val="18"/>
+        </w:rPr>
+        <w:t>fastmagento/search/grid_columns</w:t>
+      </w:r>
+      <w:r>
+        <w:rPr>
+          <w:rFonts w:ascii="var sans" w:hAnsi="var sans"/>
+          <w:sz w:val="24"/>
+          <w:bdr w:val="single" w:sz="2" w:space="17" w:color="000000"/>
+        </w:rPr>
+        <w:t xml:space="preserve"> </w:t>
+      </w:r>
+    </w:p>
+    <w:p>
+      <w:pPr>
+        <w:pStyle w:val="BodyText"/>
+        <w:bidi w:val="0"/>
+        <w:spacing w:lineRule="auto" w:line="384" w:before="0" w:after="270"/>
+        <w:jc w:val="left"/>
+        <w:rPr>
+          <w:rFonts w:ascii="var sans" w:hAnsi="var sans"/>
+          <w:sz w:val="24"/>
+          <w:bdr w:val="single" w:sz="2" w:space="17" w:color="000000"/>
+        </w:rPr>
+      </w:pPr>
+      <w:r>
+        <w:rPr>
+          <w:rFonts w:ascii="var sans" w:hAnsi="var sans"/>
+          <w:sz w:val="24"/>
+          <w:bdr w:val="single" w:sz="2" w:space="17" w:color="000000"/>
+        </w:rPr>
+        <w:t xml:space="preserve">How many products per row the instant-search results grid shows. Set it to match your </w:t>
+      </w:r>
+      <w:r>
+        <w:rPr>
+          <w:rFonts w:ascii="var sans" w:hAnsi="var sans"/>
+          <w:b/>
+          <w:sz w:val="24"/>
+          <w:bdr w:val="single" w:sz="2" w:space="17" w:color="000000"/>
+        </w:rPr>
+        <w:t>category</w:t>
+      </w:r>
+      <w:r>
+        <w:rPr>
+          <w:rFonts w:ascii="var sans" w:hAnsi="var sans"/>
+          <w:sz w:val="24"/>
+          <w:bdr w:val="single" w:sz="2" w:space="17" w:color="000000"/>
+        </w:rPr>
+        <w:t xml:space="preserve"> pages' column count so search and category listings look consistent, instead of a hard-coded 4.</w:t>
+      </w:r>
+    </w:p>
+    <w:p>
+      <w:pPr>
+        <w:pStyle w:val="BodyText"/>
+        <w:bidi w:val="0"/>
+        <w:spacing w:lineRule="auto" w:line="384" w:before="180" w:after="60"/>
+        <w:ind w:hanging="0" w:left="180" w:right="180"/>
+        <w:jc w:val="left"/>
+        <w:rPr/>
+      </w:pPr>
+      <w:r>
+        <w:rPr>
+          <w:rFonts w:ascii="var sans" w:hAnsi="var sans"/>
+          <w:sz w:val="21"/>
+          <w:bdr w:val="single" w:sz="2" w:space="9" w:color="000000"/>
+        </w:rPr>
+        <w:t xml:space="preserve">ExampleYour category pages show a 3-up grid → set this to </w:t>
+      </w:r>
+      <w:r>
+        <w:rPr>
+          <w:rStyle w:val="SourceText"/>
+          <w:rFonts w:ascii="var sans" w:hAnsi="var sans"/>
+          <w:sz w:val="21"/>
+          <w:bdr w:val="single" w:sz="2" w:space="9" w:color="000000"/>
+        </w:rPr>
+        <w:t>3</w:t>
+      </w:r>
+      <w:r>
+        <w:rPr>
+          <w:rFonts w:ascii="var sans" w:hAnsi="var sans"/>
+          <w:sz w:val="21"/>
+          <w:bdr w:val="single" w:sz="2" w:space="9" w:color="000000"/>
+        </w:rPr>
+        <w:t xml:space="preserve"> so a shopper moving from a category to a search sees the same layout.</w:t>
+      </w:r>
+    </w:p>
+    <w:p>
+      <w:pPr>
+        <w:pStyle w:val="BodyText"/>
+        <w:bidi w:val="0"/>
+        <w:spacing w:lineRule="auto" w:line="384" w:before="0" w:after="270"/>
+        <w:jc w:val="left"/>
+        <w:rPr>
+          <w:rFonts w:ascii="var sans" w:hAnsi="var sans"/>
+          <w:sz w:val="24"/>
+          <w:bdr w:val="single" w:sz="2" w:space="17" w:color="000000"/>
+        </w:rPr>
+      </w:pPr>
+      <w:r>
+        <w:rPr>
+          <w:rFonts w:ascii="var sans" w:hAnsi="var sans"/>
+          <w:sz w:val="24"/>
+          <w:bdr w:val="single" w:sz="2" w:space="17" w:color="000000"/>
+        </w:rPr>
+        <w:t xml:space="preserve">Responsive: the count is reduced automatically to at most </w:t>
+      </w:r>
+      <w:r>
+        <w:rPr>
+          <w:rFonts w:ascii="var sans" w:hAnsi="var sans"/>
+          <w:b/>
+          <w:sz w:val="24"/>
+          <w:bdr w:val="single" w:sz="2" w:space="17" w:color="000000"/>
+        </w:rPr>
+        <w:t>3 on tablet</w:t>
+      </w:r>
+      <w:r>
+        <w:rPr>
+          <w:rFonts w:ascii="var sans" w:hAnsi="var sans"/>
+          <w:sz w:val="24"/>
+          <w:bdr w:val="single" w:sz="2" w:space="17" w:color="000000"/>
+        </w:rPr>
+        <w:t xml:space="preserve"> (≤1024px) and </w:t>
+      </w:r>
+      <w:r>
+        <w:rPr>
+          <w:rFonts w:ascii="var sans" w:hAnsi="var sans"/>
+          <w:b/>
+          <w:sz w:val="24"/>
+          <w:bdr w:val="single" w:sz="2" w:space="17" w:color="000000"/>
+        </w:rPr>
+        <w:t>2 on mobile</w:t>
+      </w:r>
+      <w:r>
+        <w:rPr>
+          <w:rFonts w:ascii="var sans" w:hAnsi="var sans"/>
+          <w:sz w:val="24"/>
+          <w:bdr w:val="single" w:sz="2" w:space="17" w:color="000000"/>
+        </w:rPr>
+        <w:t xml:space="preserve"> (≤640px), so a higher desktop value never overflows a small screen.</w:t>
       </w:r>
     </w:p>
     <w:p>
@@ -3846,6 +4438,7 @@
               <w:pStyle w:val="TableHeading"/>
               <w:suppressLineNumbers/>
               <w:bidi w:val="0"/>
+              <w:spacing w:before="0" w:after="283"/>
               <w:jc w:val="center"/>
               <w:rPr/>
             </w:pPr>
@@ -3866,6 +4459,7 @@
               <w:pStyle w:val="TableHeading"/>
               <w:suppressLineNumbers/>
               <w:bidi w:val="0"/>
+              <w:spacing w:before="0" w:after="283"/>
               <w:jc w:val="center"/>
               <w:rPr/>
             </w:pPr>
@@ -3886,6 +4480,7 @@
               <w:pStyle w:val="TableHeading"/>
               <w:suppressLineNumbers/>
               <w:bidi w:val="0"/>
+              <w:spacing w:before="0" w:after="283"/>
               <w:jc w:val="center"/>
               <w:rPr/>
             </w:pPr>
@@ -3907,9 +4502,8 @@
           <w:p>
             <w:pPr>
               <w:pStyle w:val="TableContents"/>
-              <w:widowControl w:val="false"/>
-              <w:suppressLineNumbers/>
               <w:bidi w:val="0"/>
+              <w:spacing w:before="0" w:after="283"/>
               <w:jc w:val="left"/>
               <w:rPr/>
             </w:pPr>
@@ -3930,9 +4524,8 @@
           <w:p>
             <w:pPr>
               <w:pStyle w:val="TableContents"/>
-              <w:widowControl w:val="false"/>
-              <w:suppressLineNumbers/>
               <w:bidi w:val="0"/>
+              <w:spacing w:before="0" w:after="283"/>
               <w:jc w:val="left"/>
               <w:rPr/>
             </w:pPr>
@@ -3951,9 +4544,8 @@
           <w:p>
             <w:pPr>
               <w:pStyle w:val="TableContents"/>
-              <w:widowControl w:val="false"/>
-              <w:suppressLineNumbers/>
               <w:bidi w:val="0"/>
+              <w:spacing w:before="0" w:after="283"/>
               <w:jc w:val="left"/>
               <w:rPr/>
             </w:pPr>
@@ -3975,9 +4567,8 @@
           <w:p>
             <w:pPr>
               <w:pStyle w:val="TableContents"/>
-              <w:widowControl w:val="false"/>
-              <w:suppressLineNumbers/>
               <w:bidi w:val="0"/>
+              <w:spacing w:before="0" w:after="283"/>
               <w:jc w:val="left"/>
               <w:rPr/>
             </w:pPr>
@@ -3998,9 +4589,8 @@
           <w:p>
             <w:pPr>
               <w:pStyle w:val="TableContents"/>
-              <w:widowControl w:val="false"/>
-              <w:suppressLineNumbers/>
               <w:bidi w:val="0"/>
+              <w:spacing w:before="0" w:after="283"/>
               <w:jc w:val="left"/>
               <w:rPr/>
             </w:pPr>
@@ -4019,9 +4609,8 @@
           <w:p>
             <w:pPr>
               <w:pStyle w:val="TableContents"/>
-              <w:widowControl w:val="false"/>
-              <w:suppressLineNumbers/>
               <w:bidi w:val="0"/>
+              <w:spacing w:before="0" w:after="283"/>
               <w:jc w:val="left"/>
               <w:rPr/>
             </w:pPr>
@@ -4769,6 +5358,33 @@
     </w:p>
     <w:p>
       <w:pPr>
+        <w:pStyle w:val="BodyText"/>
+        <w:bidi w:val="0"/>
+        <w:spacing w:lineRule="auto" w:line="384" w:before="180" w:after="60"/>
+        <w:ind w:hanging="0" w:left="180" w:right="180"/>
+        <w:jc w:val="left"/>
+        <w:rPr/>
+      </w:pPr>
+      <w:r>
+        <w:rPr>
+          <w:rFonts w:ascii="var sans" w:hAnsi="var sans"/>
+          <w:sz w:val="21"/>
+          <w:bdr w:val="single" w:sz="2" w:space="9" w:color="000000"/>
+        </w:rPr>
+        <w:t xml:space="preserve">CLI equivalent v2.1.0Same job from the command line, for deploy pipelines: </w:t>
+      </w:r>
+      <w:r>
+        <w:rPr>
+          <w:rStyle w:val="SourceText"/>
+          <w:rFonts w:ascii="var sans" w:hAnsi="var sans"/>
+          <w:sz w:val="21"/>
+          <w:bdr w:val="single" w:sz="2" w:space="9" w:color="000000"/>
+        </w:rPr>
+        <w:t>bin/magento fastmagento:thesaurus:generate</w:t>
+      </w:r>
+    </w:p>
+    <w:p>
+      <w:pPr>
         <w:pStyle w:val="Heading2"/>
         <w:bidi w:val="0"/>
         <w:spacing w:lineRule="auto" w:line="384" w:before="0" w:after="90"/>
@@ -5964,7 +6580,233 @@
           <w:rFonts w:ascii="var sans" w:hAnsi="var sans"/>
           <w:sz w:val="24"/>
         </w:rPr>
-        <w:t>7 · Advanced (config-only)</w:t>
+        <w:t>7 · Footer Credit</w:t>
+      </w:r>
+    </w:p>
+    <w:p>
+      <w:pPr>
+        <w:pStyle w:val="BodyTextsec-sub"/>
+        <w:bidi w:val="0"/>
+        <w:spacing w:lineRule="auto" w:line="384"/>
+        <w:ind w:hanging="0" w:left="30" w:right="30"/>
+        <w:jc w:val="left"/>
+        <w:rPr>
+          <w:rFonts w:ascii="var sans" w:hAnsi="var sans"/>
+          <w:sz w:val="24"/>
+        </w:rPr>
+      </w:pPr>
+      <w:r>
+        <w:rPr>
+          <w:rFonts w:ascii="var mono" w:hAnsi="var mono"/>
+          <w:sz w:val="18"/>
+        </w:rPr>
+        <w:t>fastmagento/credit/*</w:t>
+      </w:r>
+      <w:r>
+        <w:rPr>
+          <w:rFonts w:ascii="var sans" w:hAnsi="var sans"/>
+          <w:sz w:val="24"/>
+        </w:rPr>
+        <w:t xml:space="preserve">  ·  A small, honest attribution link in the storefront footer.</w:t>
+      </w:r>
+    </w:p>
+    <w:p>
+      <w:pPr>
+        <w:pStyle w:val="Heading3"/>
+        <w:bidi w:val="0"/>
+        <w:spacing w:lineRule="auto" w:line="384" w:before="0" w:after="60"/>
+        <w:ind w:hanging="0" w:left="0" w:right="0"/>
+        <w:jc w:val="left"/>
+        <w:rPr>
+          <w:rFonts w:ascii="var sans" w:hAnsi="var sans"/>
+          <w:sz w:val="24"/>
+          <w:bdr w:val="single" w:sz="2" w:space="17" w:color="000000"/>
+        </w:rPr>
+      </w:pPr>
+      <w:r>
+        <w:rPr>
+          <w:rFonts w:ascii="var sans" w:hAnsi="var sans"/>
+          <w:sz w:val="24"/>
+          <w:bdr w:val="single" w:sz="2" w:space="17" w:color="000000"/>
+        </w:rPr>
+        <w:t>Show "Powered by FastMagento" credit</w:t>
+      </w:r>
+    </w:p>
+    <w:p>
+      <w:pPr>
+        <w:pStyle w:val="BodyText"/>
+        <w:bidi w:val="0"/>
+        <w:spacing w:lineRule="auto" w:line="384" w:before="0" w:after="60"/>
+        <w:ind w:hanging="0" w:left="0" w:right="0"/>
+        <w:jc w:val="left"/>
+        <w:rPr>
+          <w:rFonts w:ascii="var sans" w:hAnsi="var sans"/>
+          <w:sz w:val="24"/>
+          <w:bdr w:val="single" w:sz="2" w:space="17" w:color="000000"/>
+        </w:rPr>
+      </w:pPr>
+      <w:r>
+        <w:rPr>
+          <w:rFonts w:ascii="var sans" w:hAnsi="var sans"/>
+          <w:sz w:val="24"/>
+          <w:bdr w:val="single" w:sz="2" w:space="17" w:color="000000"/>
+        </w:rPr>
+        <w:t>Yes / NoDefault: YesStore-level</w:t>
+      </w:r>
+    </w:p>
+    <w:p>
+      <w:pPr>
+        <w:pStyle w:val="BodyText"/>
+        <w:bidi w:val="0"/>
+        <w:spacing w:lineRule="auto" w:line="384" w:before="120" w:after="180"/>
+        <w:ind w:hanging="0" w:left="120" w:right="120"/>
+        <w:jc w:val="left"/>
+        <w:rPr>
+          <w:rFonts w:ascii="var sans" w:hAnsi="var sans"/>
+          <w:sz w:val="24"/>
+          <w:bdr w:val="single" w:sz="2" w:space="17" w:color="000000"/>
+        </w:rPr>
+      </w:pPr>
+      <w:r>
+        <w:rPr>
+          <w:rFonts w:ascii="var mono" w:hAnsi="var mono"/>
+          <w:sz w:val="18"/>
+        </w:rPr>
+        <w:t>fastmagento/credit/show</w:t>
+      </w:r>
+      <w:r>
+        <w:rPr>
+          <w:rFonts w:ascii="var sans" w:hAnsi="var sans"/>
+          <w:sz w:val="24"/>
+          <w:bdr w:val="single" w:sz="2" w:space="17" w:color="000000"/>
+        </w:rPr>
+        <w:t xml:space="preserve"> </w:t>
+      </w:r>
+    </w:p>
+    <w:p>
+      <w:pPr>
+        <w:pStyle w:val="BodyText"/>
+        <w:bidi w:val="0"/>
+        <w:spacing w:lineRule="auto" w:line="384" w:before="0" w:after="270"/>
+        <w:jc w:val="left"/>
+        <w:rPr>
+          <w:rFonts w:ascii="var sans" w:hAnsi="var sans"/>
+          <w:sz w:val="24"/>
+          <w:bdr w:val="single" w:sz="2" w:space="17" w:color="000000"/>
+        </w:rPr>
+      </w:pPr>
+      <w:r>
+        <w:rPr>
+          <w:rFonts w:ascii="var sans" w:hAnsi="var sans"/>
+          <w:sz w:val="24"/>
+          <w:bdr w:val="single" w:sz="2" w:space="17" w:color="000000"/>
+        </w:rPr>
+        <w:t>Renders a subtle, class-based "Powered by FastMagento" credit in the footer — a real, visible attribution link (never hidden or cloaked). It's the one thing the project asks in return, and it helps other merchants find the extension.</w:t>
+      </w:r>
+    </w:p>
+    <w:p>
+      <w:pPr>
+        <w:pStyle w:val="BodyText"/>
+        <w:bidi w:val="0"/>
+        <w:spacing w:lineRule="auto" w:line="384" w:before="0" w:after="270"/>
+        <w:jc w:val="left"/>
+        <w:rPr/>
+      </w:pPr>
+      <w:r>
+        <w:rPr>
+          <w:rFonts w:ascii="var sans" w:hAnsi="var sans"/>
+          <w:sz w:val="24"/>
+          <w:bdr w:val="single" w:sz="2" w:space="17" w:color="000000"/>
+        </w:rPr>
+        <w:t xml:space="preserve">If it doesn't fit your footer, please </w:t>
+      </w:r>
+      <w:r>
+        <w:rPr>
+          <w:rFonts w:ascii="var sans" w:hAnsi="var sans"/>
+          <w:b/>
+          <w:sz w:val="24"/>
+          <w:bdr w:val="single" w:sz="2" w:space="17" w:color="000000"/>
+        </w:rPr>
+        <w:t>restyle it rather than removing it</w:t>
+      </w:r>
+      <w:r>
+        <w:rPr>
+          <w:rFonts w:ascii="var sans" w:hAnsi="var sans"/>
+          <w:sz w:val="24"/>
+          <w:bdr w:val="single" w:sz="2" w:space="17" w:color="000000"/>
+        </w:rPr>
+        <w:t xml:space="preserve"> — it's plain and class-based, so a couple of lines of CSS reskin it (</w:t>
+      </w:r>
+      <w:r>
+        <w:rPr>
+          <w:rStyle w:val="SourceTextinl"/>
+          <w:rFonts w:ascii="var sans" w:hAnsi="var sans"/>
+          <w:sz w:val="24"/>
+          <w:bdr w:val="single" w:sz="2" w:space="17" w:color="000000"/>
+        </w:rPr>
+        <w:t>.fm-credit</w:t>
+      </w:r>
+      <w:r>
+        <w:rPr>
+          <w:rFonts w:ascii="var sans" w:hAnsi="var sans"/>
+          <w:sz w:val="24"/>
+          <w:bdr w:val="single" w:sz="2" w:space="17" w:color="000000"/>
+        </w:rPr>
+        <w:t xml:space="preserve">, </w:t>
+      </w:r>
+      <w:r>
+        <w:rPr>
+          <w:rStyle w:val="SourceTextinl"/>
+          <w:rFonts w:ascii="var sans" w:hAnsi="var sans"/>
+          <w:sz w:val="24"/>
+          <w:bdr w:val="single" w:sz="2" w:space="17" w:color="000000"/>
+        </w:rPr>
+        <w:t>.fm-credit__link</w:t>
+      </w:r>
+      <w:r>
+        <w:rPr>
+          <w:rFonts w:ascii="var sans" w:hAnsi="var sans"/>
+          <w:sz w:val="24"/>
+          <w:bdr w:val="single" w:sz="2" w:space="17" w:color="000000"/>
+        </w:rPr>
+        <w:t xml:space="preserve">), or override the template </w:t>
+      </w:r>
+      <w:r>
+        <w:rPr>
+          <w:rStyle w:val="SourceTextinl"/>
+          <w:rFonts w:ascii="var sans" w:hAnsi="var sans"/>
+          <w:sz w:val="24"/>
+          <w:bdr w:val="single" w:sz="2" w:space="17" w:color="000000"/>
+        </w:rPr>
+        <w:t>ParkkTech_FastMagento::footer-credit.phtml</w:t>
+      </w:r>
+      <w:r>
+        <w:rPr>
+          <w:rFonts w:ascii="var sans" w:hAnsi="var sans"/>
+          <w:sz w:val="24"/>
+          <w:bdr w:val="single" w:sz="2" w:space="17" w:color="000000"/>
+        </w:rPr>
+        <w:t xml:space="preserve"> in your theme.</w:t>
+      </w:r>
+    </w:p>
+    <w:p>
+      <w:pPr>
+        <w:pStyle w:val="Heading2"/>
+        <w:bidi w:val="0"/>
+        <w:spacing w:lineRule="auto" w:line="384" w:before="0" w:after="90"/>
+        <w:ind w:hanging="0" w:left="0" w:right="0"/>
+        <w:jc w:val="left"/>
+        <w:rPr>
+          <w:rFonts w:ascii="var sans" w:hAnsi="var sans"/>
+          <w:sz w:val="24"/>
+        </w:rPr>
+      </w:pPr>
+      <w:r>
+        <w:rPr>
+          <w:rFonts w:ascii="var sans" w:hAnsi="var sans"/>
+          <w:sz w:val="24"/>
+        </w:rPr>
+        <w:t>8 · Advanced (config-only)</w:t>
       </w:r>
     </w:p>
     <w:p>
@@ -6336,6 +7178,8 @@
         <w:br/>
         <w:t>bin/magento fastmagento:search-keywords:generate  # optional: build the AI keyword layer</w:t>
         <w:br/>
+        <w:t>bin/magento fastmagento:thesaurus:generate  # optional: AI synonym groups (CLI parity with the admin button)</w:t>
+        <w:br/>
         <w:t>bin/magento indexer:reindex catalogsearch_fulltext fastmagento_product fastmagento_category</w:t>
         <w:br/>
         <w:br/>
@@ -6347,6 +7191,28 @@
           <w:sz w:val="18"/>
           <w:bdr w:val="single" w:sz="2" w:space="11" w:color="000000"/>
         </w:rPr>
+        <w:t># Turn on instant product update (edits go live on save)</w:t>
+      </w:r>
+      <w:r>
+        <w:rPr>
+          <w:rFonts w:ascii="var mono" w:hAnsi="var mono"/>
+          <w:sz w:val="18"/>
+          <w:bdr w:val="single" w:sz="2" w:space="11" w:color="000000"/>
+        </w:rPr>
+        <w:br/>
+        <w:t>bin/magento config:set fastmagento/indexing/instant_product_update 1</w:t>
+        <w:br/>
+        <w:t>bin/magento setup:di:compile  # new DI wiring; production mode</w:t>
+        <w:br/>
+        <w:br/>
+      </w:r>
+      <w:r>
+        <w:rPr>
+          <w:rFonts w:ascii="var mono" w:hAnsi="var mono"/>
+          <w:b/>
+          <w:sz w:val="18"/>
+          <w:bdr w:val="single" w:sz="2" w:space="11" w:color="000000"/>
+        </w:rPr>
         <w:t># Efficiency monitor on demand</w:t>
       </w:r>
       <w:r>
@@ -6403,7 +7269,7 @@
       <w:pPr>
         <w:pStyle w:val="BodyText"/>
         <w:bidi w:val="0"/>
-        <w:spacing w:lineRule="auto" w:line="384" w:before="0" w:after="140"/>
+        <w:spacing w:lineRule="auto" w:line="384" w:before="0" w:after="283"/>
         <w:jc w:val="left"/>
         <w:rPr/>
       </w:pPr>
@@ -6482,6 +7348,7 @@
       <w:pgNumType w:fmt="decimal"/>
       <w:formProt w:val="false"/>
       <w:textDirection w:val="lrTb"/>
+      <w:docGrid w:type="default" w:linePitch="600" w:charSpace="32768"/>
     </w:sectPr>
   </w:body>
 </w:document>
@@ -6509,6 +7376,9 @@
     <w:qFormat/>
     <w:pPr>
       <w:widowControl w:val="false"/>
+      <w:kinsoku w:val="true"/>
+      <w:overflowPunct w:val="true"/>
+      <w:autoSpaceDE w:val="true"/>
       <w:bidi w:val="0"/>
     </w:pPr>
     <w:rPr>
@@ -6524,16 +7394,13 @@
     <w:basedOn w:val="Heading"/>
     <w:next w:val="BodyText"/>
     <w:qFormat/>
-    <w:pPr>
-      <w:spacing w:before="240" w:after="120"/>
-      <w:outlineLvl w:val="0"/>
-    </w:pPr>
+    <w:pPr/>
     <w:rPr>
-      <w:rFonts w:ascii="Liberation Serif" w:hAnsi="Liberation Serif" w:eastAsia="WenQuanYi Zen Hei" w:cs="FreeSans"/>
+      <w:rFonts w:ascii="Noto Sans" w:hAnsi="Noto Sans"/>
       <w:b/>
       <w:bCs/>
       <w:sz w:val="48"/>
-      <w:szCs w:val="48"/>
+      <w:szCs w:val="44"/>
     </w:rPr>
   </w:style>
   <w:style w:type="paragraph" w:styleId="Heading2">
@@ -6542,6 +7409,10 @@
     <w:next w:val="BodyText"/>
     <w:qFormat/>
     <w:pPr>
+      <w:numPr>
+        <w:ilvl w:val="0"/>
+        <w:numId w:val="0"/>
+      </w:numPr>
       <w:spacing w:before="200" w:after="120"/>
       <w:outlineLvl w:val="1"/>
     </w:pPr>
@@ -6559,6 +7430,10 @@
     <w:next w:val="BodyText"/>
     <w:qFormat/>
     <w:pPr>
+      <w:numPr>
+        <w:ilvl w:val="0"/>
+        <w:numId w:val="0"/>
+      </w:numPr>
       <w:spacing w:before="140" w:after="120"/>
       <w:outlineLvl w:val="2"/>
     </w:pPr>
@@ -6576,6 +7451,10 @@
     <w:next w:val="BodyText"/>
     <w:qFormat/>
     <w:pPr>
+      <w:numPr>
+        <w:ilvl w:val="0"/>
+        <w:numId w:val="0"/>
+      </w:numPr>
       <w:spacing w:before="120" w:after="120"/>
       <w:outlineLvl w:val="3"/>
     </w:pPr>
@@ -6585,6 +7464,23 @@
       <w:bCs/>
       <w:sz w:val="24"/>
       <w:szCs w:val="24"/>
+    </w:rPr>
+  </w:style>
+  <w:style w:type="character" w:styleId="EndnoteCharacters">
+    <w:name w:val="Endnote Characters"/>
+    <w:qFormat/>
+    <w:rPr/>
+  </w:style>
+  <w:style w:type="character" w:styleId="FootnoteCharacters">
+    <w:name w:val="Footnote Characters"/>
+    <w:qFormat/>
+    <w:rPr/>
+  </w:style>
+  <w:style w:type="character" w:styleId="Hyperlink">
+    <w:name w:val="Hyperlink"/>
+    <w:rPr>
+      <w:color w:val="000080"/>
+      <w:u w:val="single"/>
     </w:rPr>
   </w:style>
   <w:style w:type="character" w:styleId="SourceText">
@@ -6600,13 +7496,6 @@
     <w:qFormat/>
     <w:rPr/>
   </w:style>
-  <w:style w:type="character" w:styleId="Hyperlink">
-    <w:name w:val="Hyperlink"/>
-    <w:rPr>
-      <w:color w:val="000080"/>
-      <w:u w:val="single"/>
-    </w:rPr>
-  </w:style>
   <w:style w:type="character" w:styleId="Emphasis">
     <w:name w:val="Emphasis"/>
     <w:qFormat/>
@@ -6615,6 +7504,44 @@
       <w:iCs/>
     </w:rPr>
   </w:style>
+  <w:style w:type="paragraph" w:styleId="HorizontalLine">
+    <w:name w:val="Horizontal Line"/>
+    <w:basedOn w:val="Normal"/>
+    <w:next w:val="BodyText"/>
+    <w:qFormat/>
+    <w:pPr>
+      <w:pBdr>
+        <w:bottom w:val="double" w:sz="2" w:space="0" w:color="808080"/>
+      </w:pBdr>
+      <w:spacing w:before="0" w:after="283"/>
+    </w:pPr>
+    <w:rPr>
+      <w:sz w:val="12"/>
+    </w:rPr>
+  </w:style>
+  <w:style w:type="paragraph" w:styleId="BodyText">
+    <w:name w:val="Body Text"/>
+    <w:basedOn w:val="Normal"/>
+    <w:pPr>
+      <w:spacing w:before="0" w:after="283"/>
+    </w:pPr>
+    <w:rPr/>
+  </w:style>
+  <w:style w:type="paragraph" w:styleId="EnvelopeReturn">
+    <w:name w:val="Envelope Return"/>
+    <w:basedOn w:val="Normal"/>
+    <w:pPr/>
+    <w:rPr>
+      <w:i/>
+    </w:rPr>
+  </w:style>
+  <w:style w:type="paragraph" w:styleId="TableContents">
+    <w:name w:val="Table Contents"/>
+    <w:basedOn w:val="BodyText"/>
+    <w:qFormat/>
+    <w:pPr/>
+    <w:rPr/>
+  </w:style>
   <w:style w:type="paragraph" w:styleId="Heading">
     <w:name w:val="Heading"/>
     <w:basedOn w:val="Normal"/>
@@ -6622,55 +7549,12 @@
     <w:qFormat/>
     <w:pPr>
       <w:keepNext w:val="true"/>
-      <w:spacing w:before="240" w:after="120"/>
+      <w:spacing w:before="240" w:after="283"/>
     </w:pPr>
     <w:rPr>
-      <w:rFonts w:ascii="Liberation Sans" w:hAnsi="Liberation Sans" w:eastAsia="WenQuanYi Zen Hei" w:cs="FreeSans"/>
+      <w:rFonts w:ascii="Liberation Sans" w:hAnsi="Liberation Sans"/>
       <w:sz w:val="28"/>
       <w:szCs w:val="28"/>
-    </w:rPr>
-  </w:style>
-  <w:style w:type="paragraph" w:styleId="BodyText">
-    <w:name w:val="Body Text"/>
-    <w:basedOn w:val="Normal"/>
-    <w:pPr>
-      <w:spacing w:lineRule="auto" w:line="276" w:before="0" w:after="140"/>
-    </w:pPr>
-    <w:rPr/>
-  </w:style>
-  <w:style w:type="paragraph" w:styleId="List">
-    <w:name w:val="List"/>
-    <w:basedOn w:val="BodyText"/>
-    <w:pPr/>
-    <w:rPr>
-      <w:rFonts w:cs="FreeSans"/>
-    </w:rPr>
-  </w:style>
-  <w:style w:type="paragraph" w:styleId="Caption">
-    <w:name w:val="Caption"/>
-    <w:basedOn w:val="Normal"/>
-    <w:qFormat/>
-    <w:pPr>
-      <w:suppressLineNumbers/>
-      <w:spacing w:before="120" w:after="120"/>
-    </w:pPr>
-    <w:rPr>
-      <w:rFonts w:cs="FreeSans"/>
-      <w:i/>
-      <w:iCs/>
-      <w:sz w:val="24"/>
-      <w:szCs w:val="24"/>
-    </w:rPr>
-  </w:style>
-  <w:style w:type="paragraph" w:styleId="Index">
-    <w:name w:val="Index"/>
-    <w:basedOn w:val="Normal"/>
-    <w:qFormat/>
-    <w:pPr>
-      <w:suppressLineNumbers/>
-    </w:pPr>
-    <w:rPr>
-      <w:rFonts w:cs="FreeSans"/>
     </w:rPr>
   </w:style>
   <w:style w:type="paragraph" w:styleId="BodyTextsec-sub">
@@ -6685,16 +7569,6 @@
       <w:sz w:val="23"/>
       <w:szCs w:val="23"/>
     </w:rPr>
-  </w:style>
-  <w:style w:type="paragraph" w:styleId="TableContents">
-    <w:name w:val="Table Contents"/>
-    <w:basedOn w:val="Normal"/>
-    <w:qFormat/>
-    <w:pPr>
-      <w:widowControl w:val="false"/>
-      <w:suppressLineNumbers/>
-    </w:pPr>
-    <w:rPr/>
   </w:style>
   <w:style w:type="paragraph" w:styleId="TableHeading">
     <w:name w:val="Table Heading"/>

</xml_diff>